<commit_message>
Regenerate county assessments with CDC PLACES chronic-disease section
</commit_message>
<xml_diff>
--- a/data/essex_needs_assessment.docx
+++ b/data/essex_needs_assessment.docx
@@ -18,7 +18,7 @@
           <w:color w:val="1E6B57"/>
           <w:sz w:val="17"/>
         </w:rPr>
-        <w:t>County and statewide figures below are published U.S. Census Bureau values; the census-tract concentration analysis is drawn from ACS 5-year tract tables; the food-insecurity figure is from Feeding America's Map the Meal Gap. ALICE, provider-ratio, and chronic-disease indicators are pending source connection and are listed at the end — not estimated.</w:t>
+        <w:t>County and statewide figures below are published U.S. Census Bureau values; the census-tract concentration analysis is drawn from ACS 5-year tract tables; the food-insecurity figure is from Feeding America's Map the Meal Gap; chronic-disease and community-health figures are from the CDC's PLACES project. ALICE and provider-ratio indicators are pending source connection and are listed at the end — not estimated.</w:t>
       </w:r>
     </w:p>
     <w:p>
@@ -101,6 +101,31 @@
         <w:rPr>
           <w:b/>
         </w:rPr>
+        <w:t>Chronic disease and community health burden</w:t>
+      </w:r>
+    </w:p>
+    <w:p>
+      <w:pPr>
+        <w:spacing w:after="200"/>
+      </w:pPr>
+      <w:r>
+        <w:t>Model-based CDC estimates put adult diabetes in Essex County at 12% (New Jersey: 10.9%), obesity at 29.6% (NJ: 28.9%), and high blood pressure at 31.7% (NJ: 32.9%).</w:t>
+      </w:r>
+      <w:r>
+        <w:rPr>
+          <w:vertAlign w:val="superscript"/>
+        </w:rPr>
+        <w:t>3</w:t>
+      </w:r>
+      <w:r>
+        <w:t xml:space="preserve"> Essex exceeds the statewide rate on 6 of the eleven tracked chronic conditions, including diabetes, obesity, and stroke. 20.1% of adults report fair or poor overall health (NJ: 17.1%) and 16% report frequent mental distress (NJ: 14.7%). On health-related social needs, 10.6% of adults report a lack of reliable transportation and 18.2% report housing insecurity (NJ: 7.4% and 12.3%). These conditions define the day-to-day clinical demand a community health center must meet — and, paired with the coverage and language barriers documented above, the case for sustained primary, dental, and behavioral-health capacity.</w:t>
+      </w:r>
+    </w:p>
+    <w:p>
+      <w:r>
+        <w:rPr>
+          <w:b/>
+        </w:rPr>
         <w:t>Food insecurity</w:t>
       </w:r>
     </w:p>
@@ -115,7 +140,7 @@
         <w:rPr>
           <w:vertAlign w:val="superscript"/>
         </w:rPr>
-        <w:t>3</w:t>
+        <w:t>4</w:t>
       </w:r>
       <w:r>
         <w:t xml:space="preserve"> Food insecurity compounds the barriers documented here: it tracks closely with low income and uninsurance and drives demand for the wraparound support Zufall's sites provide.</w:t>
@@ -327,7 +352,151 @@
               <w:rPr>
                 <w:sz w:val="18"/>
               </w:rPr>
-              <w:t>44</w:t>
+              <w:t>51</w:t>
+            </w:r>
+          </w:p>
+        </w:tc>
+      </w:tr>
+      <w:tr>
+        <w:tc>
+          <w:tcPr>
+            <w:tcW w:type="dxa" w:w="1872"/>
+          </w:tcPr>
+          <w:p>
+            <w:r/>
+            <w:r>
+              <w:rPr>
+                <w:sz w:val="18"/>
+              </w:rPr>
+              <w:t>34013007800</w:t>
+            </w:r>
+          </w:p>
+        </w:tc>
+        <w:tc>
+          <w:tcPr>
+            <w:tcW w:type="dxa" w:w="1872"/>
+          </w:tcPr>
+          <w:p>
+            <w:r/>
+            <w:r>
+              <w:rPr>
+                <w:sz w:val="18"/>
+              </w:rPr>
+              <w:t>57%</w:t>
+            </w:r>
+          </w:p>
+        </w:tc>
+        <w:tc>
+          <w:tcPr>
+            <w:tcW w:type="dxa" w:w="1872"/>
+          </w:tcPr>
+          <w:p>
+            <w:r/>
+            <w:r>
+              <w:rPr>
+                <w:sz w:val="18"/>
+              </w:rPr>
+              <w:t>44%</w:t>
+            </w:r>
+          </w:p>
+        </w:tc>
+        <w:tc>
+          <w:tcPr>
+            <w:tcW w:type="dxa" w:w="1872"/>
+          </w:tcPr>
+          <w:p>
+            <w:r/>
+            <w:r>
+              <w:rPr>
+                <w:sz w:val="18"/>
+              </w:rPr>
+              <w:t>50%</w:t>
+            </w:r>
+          </w:p>
+        </w:tc>
+        <w:tc>
+          <w:tcPr>
+            <w:tcW w:type="dxa" w:w="1872"/>
+          </w:tcPr>
+          <w:p>
+            <w:r/>
+            <w:r>
+              <w:rPr>
+                <w:sz w:val="18"/>
+              </w:rPr>
+              <w:t>46</w:t>
+            </w:r>
+          </w:p>
+        </w:tc>
+      </w:tr>
+      <w:tr>
+        <w:tc>
+          <w:tcPr>
+            <w:tcW w:type="dxa" w:w="1872"/>
+          </w:tcPr>
+          <w:p>
+            <w:r/>
+            <w:r>
+              <w:rPr>
+                <w:sz w:val="18"/>
+              </w:rPr>
+              <w:t>34013007600</w:t>
+            </w:r>
+          </w:p>
+        </w:tc>
+        <w:tc>
+          <w:tcPr>
+            <w:tcW w:type="dxa" w:w="1872"/>
+          </w:tcPr>
+          <w:p>
+            <w:r/>
+            <w:r>
+              <w:rPr>
+                <w:sz w:val="18"/>
+              </w:rPr>
+              <w:t>49%</w:t>
+            </w:r>
+          </w:p>
+        </w:tc>
+        <w:tc>
+          <w:tcPr>
+            <w:tcW w:type="dxa" w:w="1872"/>
+          </w:tcPr>
+          <w:p>
+            <w:r/>
+            <w:r>
+              <w:rPr>
+                <w:sz w:val="18"/>
+              </w:rPr>
+              <w:t>54%</w:t>
+            </w:r>
+          </w:p>
+        </w:tc>
+        <w:tc>
+          <w:tcPr>
+            <w:tcW w:type="dxa" w:w="1872"/>
+          </w:tcPr>
+          <w:p>
+            <w:r/>
+            <w:r>
+              <w:rPr>
+                <w:sz w:val="18"/>
+              </w:rPr>
+              <w:t>53%</w:t>
+            </w:r>
+          </w:p>
+        </w:tc>
+        <w:tc>
+          <w:tcPr>
+            <w:tcW w:type="dxa" w:w="1872"/>
+          </w:tcPr>
+          <w:p>
+            <w:r/>
+            <w:r>
+              <w:rPr>
+                <w:sz w:val="18"/>
+              </w:rPr>
+              <w:t>46</w:t>
             </w:r>
           </w:p>
         </w:tc>
@@ -399,7 +568,7 @@
               <w:rPr>
                 <w:sz w:val="18"/>
               </w:rPr>
-              <w:t>41</w:t>
+              <w:t>43</w:t>
             </w:r>
           </w:p>
         </w:tc>
@@ -415,7 +584,7 @@
               <w:rPr>
                 <w:sz w:val="18"/>
               </w:rPr>
-              <w:t>34013007600</w:t>
+              <w:t>34013006900</w:t>
             </w:r>
           </w:p>
         </w:tc>
@@ -429,7 +598,7 @@
               <w:rPr>
                 <w:sz w:val="18"/>
               </w:rPr>
-              <w:t>49%</w:t>
+              <w:t>45%</w:t>
             </w:r>
           </w:p>
         </w:tc>
@@ -443,79 +612,7 @@
               <w:rPr>
                 <w:sz w:val="18"/>
               </w:rPr>
-              <w:t>54%</w:t>
-            </w:r>
-          </w:p>
-        </w:tc>
-        <w:tc>
-          <w:tcPr>
-            <w:tcW w:type="dxa" w:w="1872"/>
-          </w:tcPr>
-          <w:p>
-            <w:r/>
-            <w:r>
-              <w:rPr>
-                <w:sz w:val="18"/>
-              </w:rPr>
-              <w:t>53%</w:t>
-            </w:r>
-          </w:p>
-        </w:tc>
-        <w:tc>
-          <w:tcPr>
-            <w:tcW w:type="dxa" w:w="1872"/>
-          </w:tcPr>
-          <w:p>
-            <w:r/>
-            <w:r>
-              <w:rPr>
-                <w:sz w:val="18"/>
-              </w:rPr>
-              <w:t>39</w:t>
-            </w:r>
-          </w:p>
-        </w:tc>
-      </w:tr>
-      <w:tr>
-        <w:tc>
-          <w:tcPr>
-            <w:tcW w:type="dxa" w:w="1872"/>
-          </w:tcPr>
-          <w:p>
-            <w:r/>
-            <w:r>
-              <w:rPr>
-                <w:sz w:val="18"/>
-              </w:rPr>
-              <w:t>34013007800</w:t>
-            </w:r>
-          </w:p>
-        </w:tc>
-        <w:tc>
-          <w:tcPr>
-            <w:tcW w:type="dxa" w:w="1872"/>
-          </w:tcPr>
-          <w:p>
-            <w:r/>
-            <w:r>
-              <w:rPr>
-                <w:sz w:val="18"/>
-              </w:rPr>
-              <w:t>57%</w:t>
-            </w:r>
-          </w:p>
-        </w:tc>
-        <w:tc>
-          <w:tcPr>
-            <w:tcW w:type="dxa" w:w="1872"/>
-          </w:tcPr>
-          <w:p>
-            <w:r/>
-            <w:r>
-              <w:rPr>
-                <w:sz w:val="18"/>
-              </w:rPr>
-              <w:t>44%</w:t>
+              <w:t>41%</w:t>
             </w:r>
           </w:p>
         </w:tc>
@@ -543,79 +640,7 @@
               <w:rPr>
                 <w:sz w:val="18"/>
               </w:rPr>
-              <w:t>39</w:t>
-            </w:r>
-          </w:p>
-        </w:tc>
-      </w:tr>
-      <w:tr>
-        <w:tc>
-          <w:tcPr>
-            <w:tcW w:type="dxa" w:w="1872"/>
-          </w:tcPr>
-          <w:p>
-            <w:r/>
-            <w:r>
-              <w:rPr>
-                <w:sz w:val="18"/>
-              </w:rPr>
-              <w:t>34013005400</w:t>
-            </w:r>
-          </w:p>
-        </w:tc>
-        <w:tc>
-          <w:tcPr>
-            <w:tcW w:type="dxa" w:w="1872"/>
-          </w:tcPr>
-          <w:p>
-            <w:r/>
-            <w:r>
-              <w:rPr>
-                <w:sz w:val="18"/>
-              </w:rPr>
-              <w:t>6%</w:t>
-            </w:r>
-          </w:p>
-        </w:tc>
-        <w:tc>
-          <w:tcPr>
-            <w:tcW w:type="dxa" w:w="1872"/>
-          </w:tcPr>
-          <w:p>
-            <w:r/>
-            <w:r>
-              <w:rPr>
-                <w:sz w:val="18"/>
-              </w:rPr>
-              <w:t>83%</w:t>
-            </w:r>
-          </w:p>
-        </w:tc>
-        <w:tc>
-          <w:tcPr>
-            <w:tcW w:type="dxa" w:w="1872"/>
-          </w:tcPr>
-          <w:p>
-            <w:r/>
-            <w:r>
-              <w:rPr>
-                <w:sz w:val="18"/>
-              </w:rPr>
-              <w:t>2%</w:t>
-            </w:r>
-          </w:p>
-        </w:tc>
-        <w:tc>
-          <w:tcPr>
-            <w:tcW w:type="dxa" w:w="1872"/>
-          </w:tcPr>
-          <w:p>
-            <w:r/>
-            <w:r>
-              <w:rPr>
-                <w:sz w:val="18"/>
-              </w:rPr>
-              <w:t>38</w:t>
+              <w:t>43</w:t>
             </w:r>
           </w:p>
         </w:tc>
@@ -664,7 +689,7 @@
         <w:rPr>
           <w:sz w:val="20"/>
         </w:rPr>
-        <w:t xml:space="preserve">Chronic-disease prevalence, prenatal care, and infant mortality (including racial disparity) — </w:t>
+        <w:t xml:space="preserve">Prenatal care, infant mortality (including racial disparity), and neighborhood-level chronic-disease detail — </w:t>
       </w:r>
       <w:r>
         <w:rPr>
@@ -721,7 +746,15 @@
         <w:rPr>
           <w:sz w:val="17"/>
         </w:rPr>
-        <w:t>3. Feeding America. Map the Meal Gap — 2024 county food-insecurity estimates. Retrieved from map.feedingamerica.org. Accessed August 30, 2026.</w:t>
+        <w:t>3. Centers for Disease Control and Prevention. PLACES: Local Data for Better Health, County Data, 2025 release — model-based small-area estimates (crude prevalence) from the Behavioral Risk Factor Surveillance System. Retrieved from cdc.gov/places. Accessed August 30, 2026.</w:t>
+      </w:r>
+    </w:p>
+    <w:p>
+      <w:r>
+        <w:rPr>
+          <w:sz w:val="17"/>
+        </w:rPr>
+        <w:t>4. Feeding America. Map the Meal Gap — 2024 county food-insecurity estimates. Retrieved from map.feedingamerica.org. Accessed August 30, 2026.</w:t>
       </w:r>
     </w:p>
     <w:sectPr>

</xml_diff>